<commit_message>
docs: add module creation guide and update docs to config/
</commit_message>
<xml_diff>
--- a/docs/Arquitectura_del_Proyecto.docx
+++ b/docs/Arquitectura_del_Proyecto.docx
@@ -138,7 +138,7 @@
           <w:rFonts w:ascii="Consolas" w:hAnsi="Consolas" w:eastAsia="Consolas"/>
           <w:sz w:val="18"/>
         </w:rPr>
-        <w:t>django-admin startproject woof .        # el punto = crear aquí, sin carpeta extra</w:t>
+        <w:t>django-admin startproject config .      # el punto = crear aquí, sin carpeta extra</w:t>
       </w:r>
     </w:p>
     <w:p>
@@ -221,7 +221,7 @@
           <w:rFonts w:ascii="Consolas" w:hAnsi="Consolas" w:eastAsia="Consolas"/>
           <w:sz w:val="18"/>
         </w:rPr>
-        <w:t>├── woof/</w:t>
+        <w:t>├── config/</w:t>
       </w:r>
     </w:p>
     <w:p>
@@ -527,7 +527,7 @@
                 <w:rFonts w:ascii="Consolas" w:hAnsi="Consolas"/>
                 <w:sz w:val="18"/>
               </w:rPr>
-              <w:t>woof/</w:t>
+              <w:t>config/</w:t>
             </w:r>
           </w:p>
         </w:tc>
@@ -541,7 +541,7 @@
               <w:rPr>
                 <w:sz w:val="19"/>
               </w:rPr>
-              <w:t>Carpeta de CONFIGURACIÓN del proyecto. La crea startproject con el nombre del proyecto (en el tutorial oficial se llama mysite). No lleva lógica de negocio: esa va en las apps.</w:t>
+              <w:t>Carpeta de CONFIGURACIÓN del proyecto. La crea startproject con el nombre que le das; aquí se llama config para que se entienda qué contiene (en el tutorial oficial se llama mysite). No lleva lógica de negocio: esa va en las apps.</w:t>
             </w:r>
           </w:p>
         </w:tc>
@@ -559,7 +559,7 @@
                 <w:rFonts w:ascii="Consolas" w:hAnsi="Consolas"/>
                 <w:sz w:val="18"/>
               </w:rPr>
-              <w:t>woof/settings.py</w:t>
+              <w:t>config/settings.py</w:t>
             </w:r>
           </w:p>
         </w:tc>
@@ -591,7 +591,7 @@
                 <w:rFonts w:ascii="Consolas" w:hAnsi="Consolas"/>
                 <w:sz w:val="18"/>
               </w:rPr>
-              <w:t>woof/urls.py</w:t>
+              <w:t>config/urls.py</w:t>
             </w:r>
           </w:p>
         </w:tc>
@@ -623,7 +623,7 @@
                 <w:rFonts w:ascii="Consolas" w:hAnsi="Consolas"/>
                 <w:sz w:val="18"/>
               </w:rPr>
-              <w:t>woof/wsgi.py · asgi.py</w:t>
+              <w:t>config/wsgi.py · asgi.py</w:t>
             </w:r>
           </w:p>
         </w:tc>
@@ -655,7 +655,7 @@
                 <w:rFonts w:ascii="Consolas" w:hAnsi="Consolas"/>
                 <w:sz w:val="18"/>
               </w:rPr>
-              <w:t>woof/__init__.py</w:t>
+              <w:t>config/__init__.py</w:t>
             </w:r>
           </w:p>
         </w:tc>
@@ -1064,7 +1064,7 @@
         <w:t xml:space="preserve">Proyecto vs app: </w:t>
       </w:r>
       <w:r>
-        <w:t>el proyecto (woof/) es la configuración; una app (por ejemplo mascotas/) es un módulo de funcionalidad. Un proyecto tiene muchas apps: cada módulo nuevo será una app.</w:t>
+        <w:t>el proyecto (config/) es la configuración; una app (por ejemplo mascotas/) es un módulo de funcionalidad. Un proyecto tiene muchas apps: cada módulo nuevo será una app.</w:t>
       </w:r>
     </w:p>
     <w:p>
@@ -1389,7 +1389,7 @@
     </w:p>
     <w:p>
       <w:r>
-        <w:t>Este procedimiento sirve para CUALQUIER módulo. El ejemplo crea un listado de mascotas, una página de detalle y un formulario para registrarlas, usando una plantilla base común. Todo el código fue probado (10 pruebas en verde).</w:t>
+        <w:t>Este procedimiento sirve para CUALQUIER módulo. El ejemplo crea un listado de mascotas, una página de detalle y un formulario para registrarlas, usando una plantilla base común. Todo el código fue probado (10 pruebas en verde). Hay una versión ampliada, con editar y eliminar, en Crear_un_Modulo_Mascotas.docx.</w:t>
       </w:r>
     </w:p>
     <w:p>
@@ -1768,7 +1768,7 @@
         <w:pStyle w:val="Heading2"/>
       </w:pPr>
       <w:r>
-        <w:t>Paso 2 · Registrar la app y la carpeta de plantillas (woof/settings.py)</w:t>
+        <w:t>Paso 2 · Registrar la app (config/settings.py)</w:t>
       </w:r>
     </w:p>
     <w:p>
@@ -1922,7 +1922,7 @@
           <w:rFonts w:ascii="Consolas" w:hAnsi="Consolas" w:eastAsia="Consolas"/>
           <w:sz w:val="18"/>
         </w:rPr>
-        <w:t xml:space="preserve">        'DIRS': [BASE_DIR / 'templates'],    # ← antes era []: plantillas comunes (base.html)</w:t>
+        <w:t xml:space="preserve">        'DIRS': [BASE_DIR / 'templates'],    # ya configurado: plantillas comunes (base.html)</w:t>
       </w:r>
     </w:p>
     <w:p>
@@ -1988,7 +1988,7 @@
     </w:p>
     <w:p>
       <w:r>
-        <w:t>Esto se hace una sola vez: los siguientes módulos solo se agregan a INSTALLED_APPS.</w:t>
+        <w:t>DIRS y la carpeta templates/ ya vienen configurados en el proyecto: para cada módulo nuevo solo agregas la app a INSTALLED_APPS.</w:t>
       </w:r>
     </w:p>
     <w:p>
@@ -3003,7 +3003,7 @@
     </w:p>
     <w:p>
       <w:r>
-        <w:t>Plantilla base, común a todo el sitio. Archivo templates/base.html (carpeta templates/ en la raíz del proyecto):</w:t>
+        <w:t>Plantilla base, común a todo el sitio. El archivo templates/base.html ya existe en la raíz del proyecto; así queda con el enlace al módulo:</w:t>
       </w:r>
     </w:p>
     <w:p>
@@ -4289,7 +4289,7 @@
     </w:p>
     <w:p>
       <w:r>
-        <w:t>En woof/urls.py agrega include y la ruta del módulo:</w:t>
+        <w:t>En config/urls.py agrega include y la ruta del módulo:</w:t>
       </w:r>
     </w:p>
     <w:p>
@@ -4832,7 +4832,7 @@
           <w:rFonts w:ascii="Consolas" w:hAnsi="Consolas" w:eastAsia="Consolas"/>
           <w:sz w:val="18"/>
         </w:rPr>
-        <w:t>git add mascotas templates woof</w:t>
+        <w:t>git add mascotas templates config</w:t>
       </w:r>
     </w:p>
     <w:p>
@@ -4936,7 +4936,7 @@
         <w:pStyle w:val="ListNumber"/>
       </w:pPr>
       <w:r>
-        <w:t>Controladores en views.py y rutas en &lt;app&gt;/urls.py incluidas en woof/urls.py.</w:t>
+        <w:t>Controladores en views.py y rutas en &lt;app&gt;/urls.py incluidas en config/urls.py.</w:t>
       </w:r>
     </w:p>
     <w:p>
@@ -5260,7 +5260,7 @@
               <w:rPr>
                 <w:sz w:val="19"/>
               </w:rPr>
-              <w:t>woof/settings.py</w:t>
+              <w:t>config/settings.py</w:t>
             </w:r>
           </w:p>
         </w:tc>

</xml_diff>

<commit_message>
ci: use mjs config file for commitlint
</commit_message>
<xml_diff>
--- a/docs/Arquitectura_del_Proyecto.docx
+++ b/docs/Arquitectura_del_Proyecto.docx
@@ -361,7 +361,7 @@
           <w:rFonts w:ascii="Consolas" w:hAnsi="Consolas" w:eastAsia="Consolas"/>
           <w:sz w:val="18"/>
         </w:rPr>
-        <w:t>├── .gitignore · README.md · commitlint.config.js</w:t>
+        <w:t>├── .gitignore · README.md · commitlint.config.mjs</w:t>
       </w:r>
     </w:p>
     <w:p>
@@ -998,7 +998,7 @@
                 <w:rFonts w:ascii="Consolas" w:hAnsi="Consolas"/>
                 <w:sz w:val="18"/>
               </w:rPr>
-              <w:t>commitlint.config.js</w:t>
+              <w:t>commitlint.config.mjs</w:t>
             </w:r>
           </w:p>
         </w:tc>

</xml_diff>